<commit_message>
Semester 1 Week 02: learning path, Q4 Excel answer, notebook and slide corrections
- README: before-you-start, ordered steps, outcomes, next; key answers; staff notes
- Notebooks: correct the "negatives" comments (wrong in Q6 Part A), fval note,
  Q6 Part C label, binding constraints, Part C with the cost objective; tidy
- Lecture .pptx: slides 12, 15, 18, 19, 24, 25, 26
- Answers .docx: Q2 matrix form, Q5c heading and whole-number note, 6b typo,
  notebook names, 6c cost, blank last page
- Tutorial .docx: replace the Spyder line
- New 4 Tutorial Answers/Q4 LP with Excel Solver.xlsx

Co-Authored-By: Claude Opus 5.5 <noreply@anthropic.com>
Claude-Session: https://claude.ai/code/session_01RLyQJKCaXwMcJypJVCDKWB
</commit_message>
<xml_diff>
--- a/content/Lectures/Semester 1/Week 02 - Linear Programming 1/5 Source Files/Week 2 - Linear Programming - Tutorial Answers.docx
+++ b/content/Lectures/Semester 1/Week 02 - Linear Programming 1/5 Source Files/Week 2 - Linear Programming - Tutorial Answers.docx
@@ -618,6 +618,60 @@
                   <w:lang w:eastAsia="en-GB"/>
                 </w:rPr>
               </m:ctrlPr>
+            </m:e>
+          </m:d>
+          <m:d>
+            <m:dPr>
+              <m:ctrlPr>
+                <w:rPr>
+                  <w:rFonts w:ascii="Cambria Math" w:hAnsi="Cambria Math" w:cs="Arial"/>
+                  <w:i/>
+                  <w:lang w:eastAsia="en-GB"/>
+                </w:rPr>
+              </m:ctrlPr>
+            </m:dPr>
+            <m:e>
+              <m:m>
+                <m:mPr>
+                  <m:mcs>
+                    <m:mc>
+                      <m:mcPr>
+                        <m:count m:val="1"/>
+                        <m:mcJc m:val="center"/>
+                      </m:mcPr>
+                    </m:mc>
+                  </m:mcs>
+                  <m:ctrlPr>
+                    <w:rPr>
+                      <w:rFonts w:ascii="Cambria Math" w:hAnsi="Cambria Math" w:cs="Arial"/>
+                      <w:i/>
+                      <w:lang w:eastAsia="en-GB"/>
+                    </w:rPr>
+                  </m:ctrlPr>
+                </m:mPr>
+                <m:mr>
+                  <m:e>
+                    <m:r>
+                      <w:rPr>
+                        <w:rFonts w:ascii="Cambria Math" w:hAnsi="Cambria Math" w:cs="Arial"/>
+                        <w:lang w:eastAsia="en-GB"/>
+                      </w:rPr>
+                      <m:t>x</m:t>
+                    </m:r>
+                  </m:e>
+                </m:mr>
+                <m:mr>
+                  <m:e>
+                    <m:r>
+                      <w:rPr>
+                        <w:rFonts w:ascii="Cambria Math" w:hAnsi="Cambria Math" w:cs="Arial"/>
+                        <w:lang w:eastAsia="en-GB"/>
+                      </w:rPr>
+                      <m:t>y</m:t>
+                    </m:r>
+                  </m:e>
+                </m:mr>
+              </m:m>
             </m:e>
           </m:d>
           <m:r>
@@ -922,10 +976,10 @@
         <w:t xml:space="preserve">Please see the </w:t>
       </w:r>
       <w:r>
-        <w:t>Python</w:t>
-      </w:r>
-      <w:r>
-        <w:t xml:space="preserve"> code </w:t>
+        <w:t>notebook</w:t>
+      </w:r>
+      <w:r>
+        <w:t xml:space="preserve"> “Q3 LP with linprog”.</w:t>
       </w:r>
     </w:p>
     <w:p>
@@ -1320,7 +1374,7 @@
         <w:pStyle w:val="ListParagraph"/>
       </w:pPr>
       <w:r>
-        <w:t>Please see the Python notebook for 5a, you should get the following output for the answer.</w:t>
+        <w:t>Please see the notebook “Q5a Manufacturing - products X and Y”; you should get the following output for the answer.</w:t>
       </w:r>
     </w:p>
     <w:p>
@@ -1612,10 +1666,10 @@
         <w:t xml:space="preserve">Please see the </w:t>
       </w:r>
       <w:r>
-        <w:t>Python</w:t>
-      </w:r>
-      <w:r>
-        <w:t xml:space="preserve"> code, you should get the following output for the answer.</w:t>
+        <w:t>notebook</w:t>
+      </w:r>
+      <w:r>
+        <w:t xml:space="preserve"> “Q5b Manufacturing - add product Z”; you should get the following output for the answer.</w:t>
       </w:r>
     </w:p>
     <w:p>
@@ -1685,7 +1739,7 @@
           <w:b/>
           <w:bCs/>
         </w:rPr>
-        <w:t xml:space="preserve">The firm </w:t>
+        <w:t xml:space="preserve">In addition to product Z, the firm </w:t>
       </w:r>
       <w:r>
         <w:rPr>
@@ -1758,10 +1812,10 @@
         <w:t xml:space="preserve">Please see the </w:t>
       </w:r>
       <w:r>
-        <w:t>Python</w:t>
-      </w:r>
-      <w:r>
-        <w:t xml:space="preserve"> code, you should get the following output for the answer.</w:t>
+        <w:t>notebook</w:t>
+      </w:r>
+      <w:r>
+        <w:t xml:space="preserve"> “Q5c Manufacturing - faster X”; you should get the following output for the answer.</w:t>
       </w:r>
     </w:p>
     <w:p>
@@ -2024,6 +2078,17 @@
           <w:rFonts w:eastAsiaTheme="minorEastAsia"/>
         </w:rPr>
         <w:t xml:space="preserve"> £265. Whilst this might seem negligible, scale these numbers to the thousands or millions!!</w:t>
+      </w:r>
+    </w:p>
+    <w:p>
+      <w:pPr>
+        <w:pStyle w:val="ListParagraph"/>
+      </w:pPr>
+      <w:r>
+        <w:rPr>
+          <w:rFonts w:eastAsiaTheme="minorEastAsia"/>
+        </w:rPr>
+        <w:t xml:space="preserve">The best whole-number plan earns £266, for example x = 20, y = 2, z = 2, which uses exactly 100 machine hours. Also notice that X and Z both earn £8/3 per machine hour, so the LP has other optimal solutions with the same profit of £266.67 (for example z = 20, x = 8.89); a solver may report any of them. Week 3 shows how to ask for whole numbers directly (integer programming).</w:t>
       </w:r>
     </w:p>
     <w:p>
@@ -6839,10 +6904,10 @@
         <w:t xml:space="preserve">Please see the </w:t>
       </w:r>
       <w:r>
-        <w:t>Python</w:t>
-      </w:r>
-      <w:r>
-        <w:t xml:space="preserve"> code, you should get the following output for the answer.</w:t>
+        <w:t>notebook</w:t>
+      </w:r>
+      <w:r>
+        <w:t xml:space="preserve"> “Q6 Diet problem - parts a, b and c”, Part A; you should get the following output for the answer.</w:t>
       </w:r>
     </w:p>
     <w:p>
@@ -7174,10 +7239,10 @@
         <w:t xml:space="preserve">Please see the </w:t>
       </w:r>
       <w:r>
-        <w:t>Python</w:t>
-      </w:r>
-      <w:r>
-        <w:t xml:space="preserve"> code, you should an output telling you that the problem is unbounded.</w:t>
+        <w:t>notebook</w:t>
+      </w:r>
+      <w:r>
+        <w:t xml:space="preserve"> “Q6 Diet problem - parts a, b and c”, Part B; you should get an output telling you that the problem is unbounded.</w:t>
       </w:r>
     </w:p>
     <w:p>
@@ -7909,10 +7974,10 @@
         <w:t xml:space="preserve">Please see the </w:t>
       </w:r>
       <w:r>
-        <w:t>Python</w:t>
-      </w:r>
-      <w:r>
-        <w:t xml:space="preserve"> code, you should get the following output for the answer.</w:t>
+        <w:t>notebook</w:t>
+      </w:r>
+      <w:r>
+        <w:t xml:space="preserve"> “Q6 Diet problem - parts a, b and c”, Part C; you should get the following output for the answer (maximum attractiveness). The notebook also minimises the cost under these limits: the cost rises from £93.25 to £136.52.</w:t>
       </w:r>
     </w:p>
     <w:p>
@@ -8011,7 +8076,6 @@
         </w:drawing>
       </w:r>
     </w:p>
-    <w:p/>
     <w:sectPr>
       <w:headerReference w:type="even" r:id="rId20"/>
       <w:headerReference w:type="default" r:id="rId21"/>

</xml_diff>